<commit_message>
Add validation results and sensitivity analysis
</commit_message>
<xml_diff>
--- a/report/MMA3001_Occupancy_Forecasting_Report.docx
+++ b/report/MMA3001_Occupancy_Forecasting_Report.docx
@@ -255,7 +255,7 @@
     </w:p>
     <w:p>
       <w:r>
-        <w:t>Validation, never the final test, selected the method. At 30 minutes ridge had the lowest validation MAE (1.084 people), ahead of SVR (1.133), decision tree (1.140) and persistence (1.152). Ridge was selected for accuracy, interpretability and roughly 0.04-second fitting; SVR required about 13 seconds. Five automated tests verify resampling, future-target alignment, chronological splitting, hand-calculated metrics and a synthetic end-to-end workflow.</w:t>
+        <w:t>Validation, never the final test, selected the method. At 30 minutes ridge had the lowest validation MAE (1.080 people), ahead of SVR (1.131), decision tree (1.140) and persistence (1.152). Ridge was selected for accuracy, interpretability and roughly 0.04-second fitting; SVR required about 13 seconds. Five automated tests verify resampling, future-target alignment, chronological splitting, hand-calculated metrics and a synthetic end-to-end workflow.</w:t>
       </w:r>
     </w:p>
     <w:p>
@@ -490,7 +490,7 @@
     </w:tbl>
     <w:p>
       <w:r>
-        <w:t>For the main 30-minute task, final-test MAE was 0.461 for persistence, 0.509 for SVR, 0.588 for ridge, 0.591 for the decision tree and 1.168 for the weekday/time baseline. SVR had the lowest RMSE (0.795 people), compared with 0.838 for ridge and 0.944 for persistence. Ridge overpredicted by 0.264 people. The final period was less variable than development periods, so persistence won MAE despite ridge being correctly selected from validation. The model was not reselected after test evaluation.</w:t>
+        <w:t>For the main 30-minute task, final-test MAE was 0.461 for persistence, 0.507 for SVR, 0.579 for ridge, 0.591 for the decision tree and 1.168 for the weekday/time baseline. SVR had the lowest RMSE (0.794 people), compared with 0.837 for ridge and 0.944 for persistence. Ridge overpredicted by 0.272 people. The final period was less variable than development periods, so persistence won MAE despite ridge being correctly selected from validation. The model was not reselected after test evaluation.</w:t>
       </w:r>
     </w:p>
     <w:p>

</xml_diff>